<commit_message>
Feed Kashish resume and configure 5-question interview demo grounded in AI/ML, Django, frontend persistence, and hackathons
</commit_message>
<xml_diff>
--- a/public/demo-questions-and-answers.docx
+++ b/public/demo-questions-and-answers.docx
@@ -12,7 +12,7 @@
           <w:color w:val="1D1D1F"/>
           <w:sz w:val="28"/>
         </w:rPr>
-        <w:t>Rehearse — Behavioral Interview Demonstration: Questions &amp; Sample Answers</w:t>
+        <w:t>Rehearse — Interview Demonstration: Questions &amp; Answers</w:t>
       </w:r>
     </w:p>
     <w:p>
@@ -24,7 +24,7 @@
           <w:color w:val="666666"/>
           <w:sz w:val="19"/>
         </w:rPr>
-        <w:t>Candidate: Alex Chen  |  Position: Software Engineer  |  Framework: STAR Method (5 Competencies)</w:t>
+        <w:t>Candidate: Kashish  |  Chitkara University (B.E. AI)  |  5 Tailored Questions Based on Resume</w:t>
       </w:r>
     </w:p>
     <w:p>
@@ -37,7 +37,7 @@
           <w:color w:val="D05236"/>
           <w:sz w:val="22"/>
         </w:rPr>
-        <w:t>Question 1: Teamwork &amp; Tight Deadlines</w:t>
+        <w:t>Question 1: Telecom Customer Churn Prediction (AI/ML)</w:t>
       </w:r>
     </w:p>
     <w:p>
@@ -56,7 +56,7 @@
           <w:b/>
           <w:sz w:val="20"/>
         </w:rPr>
-        <w:t>"Tell me about a time you had to work with a multidisciplinary team or peer engineer under a tight deadline. How did you ensure alignment and deliver?"</w:t>
+        <w:t>"Welcome Kashish. Could you introduce yourself and tell us about your Telecom Customer Churn Prediction project—specifically, what classification models you tested and which metrics you used to evaluate them?"</w:t>
       </w:r>
     </w:p>
     <w:p>
@@ -75,7 +75,7 @@
           <w:i/>
           <w:sz w:val="18"/>
         </w:rPr>
-        <w:t>Cross-Functional Collaboration, Agile Execution &amp; Communication Under Pressure</w:t>
+        <w:t>Machine Learning, Classification Models, Model Evaluation (Scikit-learn, Python)</w:t>
       </w:r>
     </w:p>
     <w:p>
@@ -93,7 +93,7 @@
         <w:rPr>
           <w:sz w:val="18"/>
         </w:rPr>
-        <w:t>During my software engineering internship at TechCorp Solutions, our team had a strict two-week sprint to ship an analytics reporting dashboard ahead of an executive client demo.</w:t>
+        <w:t>I built a machine learning project to predict telecom customer churn to help businesses understand why customers leave and focus retention efforts on high-value users.</w:t>
       </w:r>
     </w:p>
     <w:p>
@@ -111,7 +111,7 @@
         <w:rPr>
           <w:sz w:val="18"/>
         </w:rPr>
-        <w:t>I was responsible for collaborating with a frontend engineer and a product manager to design and deliver the customer-facing dashboard components and backend REST endpoints on time.</w:t>
+        <w:t>I needed to prepare the customer dataset, train multiple classification models, and evaluate which model provided the best predictive performance.</w:t>
       </w:r>
     </w:p>
     <w:p>
@@ -129,7 +129,7 @@
         <w:rPr>
           <w:sz w:val="18"/>
         </w:rPr>
-        <w:t>I set up a daily 10-minute morning standup to surface blockers immediately, established OpenAPI and TypeScript interface contracts on day one, and built mock API fixtures so frontend development could proceed in parallel without waiting on database migrations.</w:t>
+        <w:t>Using Python and Scikit-learn, I experimented with Logistic Regression and Random Forest classifiers. I conducted feature importance analysis to identify top churn factors like contract type and monthly charges. Because identifying at-risk customers early is critical, I prioritized Recall and ROC-AUC over simple accuracy.</w:t>
       </w:r>
     </w:p>
     <w:p>
@@ -147,7 +147,7 @@
         <w:rPr>
           <w:sz w:val="18"/>
         </w:rPr>
-        <w:t>We shipped the feature two days ahead of the delivery date with zero integration defects during QA, resulting in a successful client presentation and renewal.</w:t>
+        <w:t>The Random Forest model achieved strong recall and provided actionable segmentation insights for customer retention campaigns.</w:t>
       </w:r>
     </w:p>
     <w:p>
@@ -171,7 +171,7 @@
           <w:color w:val="D05236"/>
           <w:sz w:val="22"/>
         </w:rPr>
-        <w:t>Question 2: Conflict &amp; Disagreement Resolution</w:t>
+        <w:t>Question 2: Data Preprocessing &amp; Feature Engineering</w:t>
       </w:r>
     </w:p>
     <w:p>
@@ -190,7 +190,7 @@
           <w:b/>
           <w:sz w:val="20"/>
         </w:rPr>
-        <w:t>"Describe a situation where you had a strong disagreement with a teammate regarding a technical or product choice. How did you handle it and what was the outcome?"</w:t>
+        <w:t>"In your telecom churn analysis, how did you handle data preprocessing and feature engineering with Pandas and NumPy, especially for missing values and categorical data?"</w:t>
       </w:r>
     </w:p>
     <w:p>
@@ -209,7 +209,7 @@
           <w:i/>
           <w:sz w:val="18"/>
         </w:rPr>
-        <w:t>Objective Technical Reasoning, Constructive Compromise &amp; Team Cohesion</w:t>
+        <w:t>Data Wrangling, Feature Scaling, Encoding &amp; Data Hygiene (Pandas, NumPy)</w:t>
       </w:r>
     </w:p>
     <w:p>
@@ -227,7 +227,7 @@
         <w:rPr>
           <w:sz w:val="18"/>
         </w:rPr>
-        <w:t>While building TaskFlow, our full-stack collaborative task management application, a peer engineer advocated for using MongoDB for rapid schema flexibility, whereas I recommended PostgreSQL.</w:t>
+        <w:t>The telecom customer dataset contained a mix of numerical metrics like total spend and categorical features like payment methods, with missing values in tenure records.</w:t>
       </w:r>
     </w:p>
     <w:p>
@@ -245,7 +245,7 @@
         <w:rPr>
           <w:sz w:val="18"/>
         </w:rPr>
-        <w:t>We needed to reach a consensus without delaying our sprint kickoff or creating technical debt.</w:t>
+        <w:t>I had to clean and preprocess the raw data so machine learning algorithms could process the features without bias or data leakage.</w:t>
       </w:r>
     </w:p>
     <w:p>
@@ -263,7 +263,7 @@
         <w:rPr>
           <w:sz w:val="18"/>
         </w:rPr>
-        <w:t>Rather than debating preferences, I proposed an objective benchmark matrix. We analyzed our core entity relationships—project boards, tasks, user permissions, and audit logs. I demonstrated that relational integrity with foreign keys and ACID transaction guarantees was essential to avoid orphaned subtasks during concurrent drag-and-drop operations.</w:t>
+        <w:t>I used Pandas to impute missing values using median values for skewed numerical columns. I applied One-Hot Encoding on nominal categorical variables such as contract type, and standardized continuous numerical features using StandardScaler from Scikit-learn.</w:t>
       </w:r>
     </w:p>
     <w:p>
@@ -281,7 +281,7 @@
         <w:rPr>
           <w:sz w:val="18"/>
         </w:rPr>
-        <w:t>My teammate reviewed the prototype and agreed PostgreSQL was the sounder architectural choice. We completed the project on schedule, maintaining 100% data consistency across thousands of simulated task updates.</w:t>
+        <w:t>This data preprocessing pipeline ensured clean, normalized training data, improving model convergence and preventing overfitting.</w:t>
       </w:r>
     </w:p>
     <w:p>
@@ -305,7 +305,7 @@
           <w:color w:val="D05236"/>
           <w:sz w:val="22"/>
         </w:rPr>
-        <w:t>Question 3: Navigating Setbacks &amp; Incident Recovery</w:t>
+        <w:t>Question 3: TOGETHERLY – LinkedIn Clone (Backend &amp; Database)</w:t>
       </w:r>
     </w:p>
     <w:p>
@@ -324,7 +324,7 @@
           <w:b/>
           <w:sz w:val="20"/>
         </w:rPr>
-        <w:t>"Can you share an experience where a project or deployment didn't go as planned or failed? What immediate actions did you take, and what did you learn?"</w:t>
+        <w:t>"You built TOGETHERLY, a LinkedIn clone using Django and SQLite. How did you structure your models and implement user authentication, CRUD operations, and real-time messaging?"</w:t>
       </w:r>
     </w:p>
     <w:p>
@@ -343,7 +343,7 @@
           <w:i/>
           <w:sz w:val="18"/>
         </w:rPr>
-        <w:t>Composure Under Pressure, Rapid Incident Response &amp; Continuous Learning</w:t>
+        <w:t>Backend Architecture, Relational Schema, CRUD &amp; Authentication (Django, SQLite)</w:t>
       </w:r>
     </w:p>
     <w:p>
@@ -361,7 +361,7 @@
         <w:rPr>
           <w:sz w:val="18"/>
         </w:rPr>
-        <w:t>During a staging deployment for the Campus Marketplace platform, an automated database migration script failed due to an unindexed unique constraint conflict on legacy user records, locking the staging database.</w:t>
+        <w:t>I wanted to understand full-stack platform architecture by developing a professional networking platform with user profiles, posts, and peer-to-peer messaging.</w:t>
       </w:r>
     </w:p>
     <w:p>
@@ -379,7 +379,7 @@
         <w:rPr>
           <w:sz w:val="18"/>
         </w:rPr>
-        <w:t>As the engineer running the deployment, I had to restore staging availability immediately and resolve the root cause of the schema failure.</w:t>
+        <w:t>I needed to implement secure authentication, database relationships, and real-time interaction using Django and SQLite.</w:t>
       </w:r>
     </w:p>
     <w:p>
@@ -397,7 +397,7 @@
         <w:rPr>
           <w:sz w:val="18"/>
         </w:rPr>
-        <w:t>I immediately notified the team on Slack, executed our automated rollback script to restore staging traffic within three minutes, and analyzed the migration logs. I isolated the conflicting records, wrote a safe, idempotent data-cleaning migration step, added comprehensive unit tests, and verified the fix against a sanitized production clone.</w:t>
+        <w:t>I leveraged Django's built-in authentication system for secure passwords and sessions. I created relational models with foreign keys linking users to posts, comments, and connection requests. For messaging, I implemented conversation and message models with timestamped CRUD views.</w:t>
       </w:r>
     </w:p>
     <w:p>
@@ -415,7 +415,7 @@
         <w:rPr>
           <w:sz w:val="18"/>
         </w:rPr>
-        <w:t>The revised migration deployed cleanly in under ten seconds. I also added pre-deployment dry-run validation scripts to our CI/CD pipeline, permanently preventing similar constraint failures.</w:t>
+        <w:t>Togetherly allowed users to create accounts, publish posts with full CRUD operations, and send direct messages, giving me hands-on backend design experience.</w:t>
       </w:r>
     </w:p>
     <w:p>
@@ -439,7 +439,7 @@
           <w:color w:val="D05236"/>
           <w:sz w:val="22"/>
         </w:rPr>
-        <w:t>Question 4: Initiative &amp; Organizational Ownership</w:t>
+        <w:t>Question 4: INNOFIND – Tech Resource Discovery Platform (Frontend)</w:t>
       </w:r>
     </w:p>
     <w:p>
@@ -458,7 +458,7 @@
           <w:b/>
           <w:sz w:val="20"/>
         </w:rPr>
-        <w:t>"Tell me about a time you went beyond your assigned responsibilities to solve a problem or improve a process for your team."</w:t>
+        <w:t>"For INNOFIND, you created a tech resource discovery platform using HTML, CSS, and JavaScript. How did you implement local storage for data persistence across features like the to-do list and calendar?"</w:t>
       </w:r>
     </w:p>
     <w:p>
@@ -477,7 +477,7 @@
           <w:i/>
           <w:sz w:val="18"/>
         </w:rPr>
-        <w:t>Proactive Problem Solving, Engineering Excellence &amp; Developer Enablement</w:t>
+        <w:t>Frontend Engineering, DOM Manipulation &amp; Client-Side Persistence (JavaScript)</w:t>
       </w:r>
     </w:p>
     <w:p>
@@ -495,7 +495,7 @@
         <w:rPr>
           <w:sz w:val="18"/>
         </w:rPr>
-        <w:t>When I joined TechCorp Solutions as an intern, new contributor onboarding was a painful multi-step manual process. Conflicting Node and Docker versions frequently cost new engineers half a day to troubleshoot.</w:t>
+        <w:t>When learning tech concepts, students often lose track of helpful resources, tasks, and study schedules across different websites.</w:t>
       </w:r>
     </w:p>
     <w:p>
@@ -513,7 +513,7 @@
         <w:rPr>
           <w:sz w:val="18"/>
         </w:rPr>
-        <w:t>Although my assigned sprint tickets were strictly user-facing dashboard features, I recognized that fixing onboarding friction would permanently save engineering hours across the entire team.</w:t>
+        <w:t>I built INNOFIND as a centralized discovery hub with an integrated to-do list, calendar, and themes, requiring client-side data persistence without a heavy backend.</w:t>
       </w:r>
     </w:p>
     <w:p>
@@ -531,7 +531,7 @@
         <w:rPr>
           <w:sz w:val="18"/>
         </w:rPr>
-        <w:t>Over the weekend, I containerized the entire local development stack using Docker Compose, authored a one-command bootstrap script (./scripts/dev-setup.sh), and restructured the outdated setup documentation with step-by-step verification checks.</w:t>
+        <w:t>I used the browser's localStorage API to store serialized JSON strings for user notes, tasks, and calendar events. When a user added or completed a task, the JavaScript state was updated and saved to localStorage. On page load, the app hydrated the UI from stored data.</w:t>
       </w:r>
     </w:p>
     <w:p>
@@ -549,7 +549,7 @@
         <w:rPr>
           <w:sz w:val="18"/>
         </w:rPr>
-        <w:t>I submitted a pull request with full documentation. The engineering lead approved it, and it reduced developer onboarding time from four hours to under fifteen minutes across all incoming contributors.</w:t>
+        <w:t>Users could customize themes, organize their study calendar, and persist their daily tasks across browser sessions with zero server latency.</w:t>
       </w:r>
     </w:p>
     <w:p>
@@ -573,7 +573,7 @@
           <w:color w:val="D05236"/>
           <w:sz w:val="22"/>
         </w:rPr>
-        <w:t>Question 5: Prioritization &amp; Competing Urgencies</w:t>
+        <w:t>Question 5: Hackathons, Team Collaboration &amp; Critical Thinking</w:t>
       </w:r>
     </w:p>
     <w:p>
@@ -592,7 +592,7 @@
           <w:b/>
           <w:sz w:val="20"/>
         </w:rPr>
-        <w:t>"How do you handle situations where you are faced with competing priorities or urgent requests from stakeholders while already committed to a delivery date?"</w:t>
+        <w:t>"You've participated in hackathons like the Smart India Hackathon (SIH) and won second place in Intellex at Chitkara University. Tell me about a time in a team project or hackathon where you faced a tough technical roadblock and how you collaborated to solve it."</w:t>
       </w:r>
     </w:p>
     <w:p>
@@ -611,7 +611,7 @@
           <w:i/>
           <w:sz w:val="18"/>
         </w:rPr>
-        <w:t>Urgency vs. Impact Triage, Transparent Communication &amp; Scope Management</w:t>
+        <w:t>Critical Thinking, Teamwork Under Pressure &amp; Problem Solving</w:t>
       </w:r>
     </w:p>
     <w:p>
@@ -629,7 +629,7 @@
         <w:rPr>
           <w:sz w:val="18"/>
         </w:rPr>
-        <w:t>During release week at TechCorp, while midway through implementing critical security authentication patches, customer success submitted an urgent request for a custom CSV export feature for a high-priority enterprise prospect.</w:t>
+        <w:t>During a hackathon, our team had only a few hours remaining before the final presentation when our frontend and backend data formats collided, breaking our live demo.</w:t>
       </w:r>
     </w:p>
     <w:p>
@@ -647,7 +647,7 @@
         <w:rPr>
           <w:sz w:val="18"/>
         </w:rPr>
-        <w:t>I had to handle the customer request without compromising our scheduled security fixes or missing our deployment window.</w:t>
+        <w:t>As a team, we needed to quickly diagnose the discrepancy and fix the API response structure without panic.</w:t>
       </w:r>
     </w:p>
     <w:p>
@@ -665,7 +665,7 @@
         <w:rPr>
           <w:sz w:val="18"/>
         </w:rPr>
-        <w:t>I applied an urgency-versus-impact triage: security was non-negotiable. I immediately met with the product manager and customer success lead, transparently laid out our capacity, and proposed an agile compromise: I built a lightweight CSV export endpoint within two hours to satisfy the client demo, while scoping the full automated reporting engine for the subsequent sprint.</w:t>
+        <w:t>I called an immediate 10-minute huddle. Drawing on critical thinking techniques, we mapped the exact JSON schema required by our UI components. I took responsibility for updating our backend serializer to match the contract, while my teammate updated the frontend fetch handler.</w:t>
       </w:r>
     </w:p>
     <w:p>
@@ -683,7 +683,7 @@
         <w:rPr>
           <w:sz w:val="18"/>
         </w:rPr>
-        <w:t>The client signed the contract, our security authentication fixes shipped on schedule with zero regressions, and both stakeholders appreciated the transparent communication.</w:t>
+        <w:t>We resolved the bug in thirty minutes, presented our working prototype on schedule to the judges, and placed successfully in the competition.</w:t>
       </w:r>
     </w:p>
     <w:p>

</xml_diff>